<commit_message>
Atualização para V2.1 - adição de interface inteligente
</commit_message>
<xml_diff>
--- a/doc/Modelo_de_Termo.docx
+++ b/doc/Modelo_de_Termo.docx
@@ -79,330 +79,118 @@
         <w:t xml:space="preserve">NOME: </w:t>
       </w:r>
       <w:r>
-        <w:t>{</w:t>
-      </w:r>
-      <w:r>
-        <w:rPr>
-          <w:rFonts w:ascii="Arial" w:hAnsi="Arial" w:cs="Arial"/>
-          <w:b/>
-          <w:bCs/>
-          <w:color w:val="222222"/>
-          <w:shd w:val="clear" w:color="auto" w:fill="FFFFFF"/>
-        </w:rPr>
-        <w:t>{nome}</w:t>
-      </w:r>
-      <w:r>
-        <w:rPr>
-          <w:rFonts w:ascii="Arial" w:hAnsi="Arial" w:cs="Arial"/>
-          <w:b/>
-          <w:bCs/>
-          <w:color w:val="222222"/>
-          <w:shd w:val="clear" w:color="auto" w:fill="FFFFFF"/>
-        </w:rPr>
-        <w:t>}</w:t>
-      </w:r>
-      <w:r>
-        <w:rPr>
-          <w:b/>
-          <w:sz w:val="28"/>
-        </w:rPr>
+        <w:t xml:space="preserve">{{nome}} </w:t>
+      </w:r>
+      <w:r>
+        <w:t xml:space="preserve">CPF: </w:t>
+      </w:r>
+      <w:r>
+        <w:t>{{</w:t>
+      </w:r>
+      <w:proofErr w:type="spellStart"/>
+      <w:proofErr w:type="gramStart"/>
+      <w:r>
+        <w:t>cpf</w:t>
+      </w:r>
+      <w:proofErr w:type="spellEnd"/>
+      <w:proofErr w:type="gramEnd"/>
+      <w:r>
+        <w:t>}}</w:t>
+      </w:r>
+      <w:r>
         <w:t xml:space="preserve"> </w:t>
       </w:r>
       <w:r>
-        <w:t xml:space="preserve">CPF: </w:t>
-      </w:r>
-      <w:r>
-        <w:t>{</w:t>
-      </w:r>
-      <w:r>
+        <w:t xml:space="preserve">RG: </w:t>
+      </w:r>
+      <w:r>
+        <w:t>{{</w:t>
+      </w:r>
+      <w:proofErr w:type="spellStart"/>
+      <w:r>
+        <w:t>rg</w:t>
+      </w:r>
+      <w:proofErr w:type="spellEnd"/>
+      <w:r>
+        <w:t>}}</w:t>
+      </w:r>
+    </w:p>
+    <w:p/>
+    <w:p>
+      <w:r>
+        <w:t xml:space="preserve">ENDEREÇO: </w:t>
+      </w:r>
+      <w:r>
+        <w:t>{{</w:t>
+      </w:r>
+      <w:proofErr w:type="spellStart"/>
+      <w:proofErr w:type="gramStart"/>
+      <w:r>
+        <w:t>cep</w:t>
+      </w:r>
+      <w:proofErr w:type="spellEnd"/>
+      <w:proofErr w:type="gramEnd"/>
+      <w:r>
+        <w:t xml:space="preserve">}} - </w:t>
+      </w:r>
+      <w:bookmarkStart w:id="0" w:name="_GoBack"/>
+      <w:bookmarkEnd w:id="0"/>
+      <w:r>
+        <w:t>{{endereco}}</w:t>
+      </w:r>
+      <w:r>
+        <w:t xml:space="preserve"> </w:t>
+      </w:r>
+      <w:r>
+        <w:t>–</w:t>
+      </w:r>
+      <w:r>
+        <w:t xml:space="preserve"> </w:t>
+      </w:r>
+      <w:r>
+        <w:t>{{bairro}}</w:t>
+      </w:r>
+      <w:r>
+        <w:t xml:space="preserve">, </w:t>
+      </w:r>
+      <w:r>
+        <w:t>{{cidade}}</w:t>
+      </w:r>
+      <w:r>
+        <w:t xml:space="preserve">, </w:t>
+      </w:r>
+      <w:r>
+        <w:t>{{uf}}</w:t>
+      </w:r>
+    </w:p>
+    <w:p>
+      <w:pPr>
         <w:rPr>
           <w:rFonts w:ascii="Arial" w:hAnsi="Arial" w:cs="Arial"/>
           <w:color w:val="222222"/>
           <w:shd w:val="clear" w:color="auto" w:fill="FFFFFF"/>
         </w:rPr>
-        <w:t>{</w:t>
-      </w:r>
-      <w:proofErr w:type="spellStart"/>
-      <w:proofErr w:type="gramStart"/>
-      <w:r>
-        <w:rPr>
-          <w:rFonts w:ascii="Arial" w:hAnsi="Arial" w:cs="Arial"/>
-          <w:color w:val="222222"/>
-          <w:shd w:val="clear" w:color="auto" w:fill="FFFFFF"/>
-        </w:rPr>
-        <w:t>cpf</w:t>
-      </w:r>
-      <w:proofErr w:type="spellEnd"/>
-      <w:proofErr w:type="gramEnd"/>
-      <w:r>
-        <w:rPr>
-          <w:rFonts w:ascii="Arial" w:hAnsi="Arial" w:cs="Arial"/>
-          <w:color w:val="222222"/>
-          <w:shd w:val="clear" w:color="auto" w:fill="FFFFFF"/>
-        </w:rPr>
-        <w:t>}</w:t>
-      </w:r>
-      <w:r>
-        <w:rPr>
-          <w:rFonts w:ascii="Arial" w:hAnsi="Arial" w:cs="Arial"/>
-          <w:color w:val="222222"/>
-          <w:shd w:val="clear" w:color="auto" w:fill="FFFFFF"/>
-        </w:rPr>
-        <w:t>}</w:t>
-      </w:r>
-      <w:r>
-        <w:rPr>
-          <w:rFonts w:ascii="Arial" w:hAnsi="Arial" w:cs="Arial"/>
-          <w:color w:val="222222"/>
-          <w:shd w:val="clear" w:color="auto" w:fill="FFFFFF"/>
-        </w:rPr>
+      </w:pPr>
+    </w:p>
+    <w:p/>
+    <w:p>
+      <w:pPr>
+        <w:jc w:val="both"/>
+      </w:pPr>
+      <w:r>
+        <w:t xml:space="preserve">DADOS DO APARELHO: </w:t>
+      </w:r>
+      <w:r>
+        <w:t xml:space="preserve">13ª geração Intel® Core™ i5-1345U (10-core, cache de 12 MB, até 4.70 GHz) </w:t>
+      </w:r>
+      <w:r>
+        <w:t>SN:</w:t>
+      </w:r>
+      <w:r>
         <w:t xml:space="preserve"> </w:t>
       </w:r>
       <w:r>
-        <w:t xml:space="preserve">RG: </w:t>
-      </w:r>
-      <w:r>
-        <w:t>{</w:t>
-      </w:r>
-      <w:r>
-        <w:rPr>
-          <w:rFonts w:ascii="Arial" w:hAnsi="Arial" w:cs="Arial"/>
-          <w:color w:val="222222"/>
-          <w:shd w:val="clear" w:color="auto" w:fill="FFFFFF"/>
-        </w:rPr>
-        <w:t>{</w:t>
-      </w:r>
-      <w:proofErr w:type="spellStart"/>
-      <w:r>
-        <w:rPr>
-          <w:rFonts w:ascii="Arial" w:hAnsi="Arial" w:cs="Arial"/>
-          <w:color w:val="222222"/>
-          <w:shd w:val="clear" w:color="auto" w:fill="FFFFFF"/>
-        </w:rPr>
-        <w:t>rg</w:t>
-      </w:r>
-      <w:proofErr w:type="spellEnd"/>
-      <w:r>
-        <w:rPr>
-          <w:rFonts w:ascii="Arial" w:hAnsi="Arial" w:cs="Arial"/>
-          <w:color w:val="222222"/>
-          <w:shd w:val="clear" w:color="auto" w:fill="FFFFFF"/>
-        </w:rPr>
-        <w:t>}</w:t>
-      </w:r>
-      <w:r>
-        <w:rPr>
-          <w:rFonts w:ascii="Arial" w:hAnsi="Arial" w:cs="Arial"/>
-          <w:color w:val="222222"/>
-          <w:shd w:val="clear" w:color="auto" w:fill="FFFFFF"/>
-        </w:rPr>
-        <w:t>}</w:t>
-      </w:r>
-    </w:p>
-    <w:p/>
-    <w:p>
-      <w:pPr>
-        <w:rPr>
-          <w:rFonts w:ascii="Arial" w:hAnsi="Arial" w:cs="Arial"/>
-          <w:color w:val="222222"/>
-          <w:shd w:val="clear" w:color="auto" w:fill="FFFFFF"/>
-        </w:rPr>
-      </w:pPr>
-      <w:r>
-        <w:t xml:space="preserve">ENDEREÇO: </w:t>
-      </w:r>
-      <w:r>
-        <w:t>{</w:t>
-      </w:r>
-      <w:r>
-        <w:rPr>
-          <w:rFonts w:ascii="Arial" w:hAnsi="Arial" w:cs="Arial"/>
-          <w:color w:val="222222"/>
-          <w:shd w:val="clear" w:color="auto" w:fill="FFFFFF"/>
-        </w:rPr>
-        <w:t>{</w:t>
-      </w:r>
-      <w:proofErr w:type="spellStart"/>
-      <w:r>
-        <w:rPr>
-          <w:rFonts w:ascii="Arial" w:hAnsi="Arial" w:cs="Arial"/>
-          <w:color w:val="222222"/>
-          <w:shd w:val="clear" w:color="auto" w:fill="FFFFFF"/>
-        </w:rPr>
-        <w:t>endereco</w:t>
-      </w:r>
-      <w:proofErr w:type="spellEnd"/>
-      <w:r>
-        <w:rPr>
-          <w:rFonts w:ascii="Arial" w:hAnsi="Arial" w:cs="Arial"/>
-          <w:color w:val="222222"/>
-          <w:shd w:val="clear" w:color="auto" w:fill="FFFFFF"/>
-        </w:rPr>
-        <w:t>}</w:t>
-      </w:r>
-      <w:r>
-        <w:rPr>
-          <w:rFonts w:ascii="Arial" w:hAnsi="Arial" w:cs="Arial"/>
-          <w:color w:val="222222"/>
-          <w:shd w:val="clear" w:color="auto" w:fill="FFFFFF"/>
-        </w:rPr>
-        <w:t>}</w:t>
-      </w:r>
-      <w:r>
-        <w:rPr>
-          <w:rFonts w:ascii="Arial" w:hAnsi="Arial" w:cs="Arial"/>
-          <w:color w:val="222222"/>
-          <w:shd w:val="clear" w:color="auto" w:fill="FFFFFF"/>
-        </w:rPr>
-        <w:t xml:space="preserve"> </w:t>
-      </w:r>
-      <w:r>
-        <w:rPr>
-          <w:rFonts w:ascii="Arial" w:hAnsi="Arial" w:cs="Arial"/>
-          <w:color w:val="222222"/>
-          <w:shd w:val="clear" w:color="auto" w:fill="FFFFFF"/>
-        </w:rPr>
-        <w:t>–</w:t>
-      </w:r>
-      <w:r>
-        <w:rPr>
-          <w:rFonts w:ascii="Arial" w:hAnsi="Arial" w:cs="Arial"/>
-          <w:color w:val="222222"/>
-          <w:shd w:val="clear" w:color="auto" w:fill="FFFFFF"/>
-        </w:rPr>
-        <w:t xml:space="preserve"> </w:t>
-      </w:r>
-      <w:r>
-        <w:rPr>
-          <w:rFonts w:ascii="Arial" w:hAnsi="Arial" w:cs="Arial"/>
-          <w:color w:val="222222"/>
-          <w:shd w:val="clear" w:color="auto" w:fill="FFFFFF"/>
-        </w:rPr>
-        <w:t>{</w:t>
-      </w:r>
-      <w:r>
-        <w:rPr>
-          <w:rFonts w:ascii="Arial" w:hAnsi="Arial" w:cs="Arial"/>
-          <w:color w:val="222222"/>
-          <w:shd w:val="clear" w:color="auto" w:fill="FFFFFF"/>
-        </w:rPr>
-        <w:t>{bairro}</w:t>
-      </w:r>
-      <w:r>
-        <w:rPr>
-          <w:rFonts w:ascii="Arial" w:hAnsi="Arial" w:cs="Arial"/>
-          <w:color w:val="222222"/>
-          <w:shd w:val="clear" w:color="auto" w:fill="FFFFFF"/>
-        </w:rPr>
-        <w:t>}</w:t>
-      </w:r>
-      <w:r>
-        <w:rPr>
-          <w:rFonts w:ascii="Arial" w:hAnsi="Arial" w:cs="Arial"/>
-          <w:color w:val="222222"/>
-          <w:shd w:val="clear" w:color="auto" w:fill="FFFFFF"/>
-        </w:rPr>
-        <w:t xml:space="preserve">, </w:t>
-      </w:r>
-      <w:r>
-        <w:rPr>
-          <w:rFonts w:ascii="Arial" w:hAnsi="Arial" w:cs="Arial"/>
-          <w:color w:val="222222"/>
-          <w:shd w:val="clear" w:color="auto" w:fill="FFFFFF"/>
-        </w:rPr>
-        <w:t>{</w:t>
-      </w:r>
-      <w:r>
-        <w:rPr>
-          <w:rFonts w:ascii="Arial" w:hAnsi="Arial" w:cs="Arial"/>
-          <w:color w:val="222222"/>
-          <w:shd w:val="clear" w:color="auto" w:fill="FFFFFF"/>
-        </w:rPr>
-        <w:t>{cidade}</w:t>
-      </w:r>
-      <w:r>
-        <w:rPr>
-          <w:rFonts w:ascii="Arial" w:hAnsi="Arial" w:cs="Arial"/>
-          <w:color w:val="222222"/>
-          <w:shd w:val="clear" w:color="auto" w:fill="FFFFFF"/>
-        </w:rPr>
-        <w:t>}</w:t>
-      </w:r>
-      <w:r>
-        <w:rPr>
-          <w:rFonts w:ascii="Arial" w:hAnsi="Arial" w:cs="Arial"/>
-          <w:color w:val="222222"/>
-          <w:shd w:val="clear" w:color="auto" w:fill="FFFFFF"/>
-        </w:rPr>
-        <w:t xml:space="preserve">, </w:t>
-      </w:r>
-      <w:r>
-        <w:rPr>
-          <w:rFonts w:ascii="Arial" w:hAnsi="Arial" w:cs="Arial"/>
-          <w:color w:val="222222"/>
-          <w:shd w:val="clear" w:color="auto" w:fill="FFFFFF"/>
-        </w:rPr>
-        <w:t>{</w:t>
-      </w:r>
-      <w:r>
-        <w:rPr>
-          <w:rFonts w:ascii="Arial" w:hAnsi="Arial" w:cs="Arial"/>
-          <w:color w:val="222222"/>
-          <w:shd w:val="clear" w:color="auto" w:fill="FFFFFF"/>
-        </w:rPr>
-        <w:t>{uf}</w:t>
-      </w:r>
-      <w:r>
-        <w:rPr>
-          <w:rFonts w:ascii="Arial" w:hAnsi="Arial" w:cs="Arial"/>
-          <w:color w:val="222222"/>
-          <w:shd w:val="clear" w:color="auto" w:fill="FFFFFF"/>
-        </w:rPr>
-        <w:t>}</w:t>
-      </w:r>
-    </w:p>
-    <w:p>
-      <w:pPr>
-        <w:rPr>
-          <w:rFonts w:ascii="Arial" w:hAnsi="Arial" w:cs="Arial"/>
-          <w:color w:val="222222"/>
-          <w:shd w:val="clear" w:color="auto" w:fill="FFFFFF"/>
-        </w:rPr>
-      </w:pPr>
-    </w:p>
-    <w:p>
-      <w:pPr>
-        <w:rPr>
-          <w:rFonts w:ascii="Arial" w:hAnsi="Arial" w:cs="Arial"/>
-          <w:color w:val="222222"/>
-          <w:shd w:val="clear" w:color="auto" w:fill="FFFFFF"/>
-        </w:rPr>
-      </w:pPr>
-    </w:p>
-    <w:p>
-      <w:pPr>
-        <w:jc w:val="both"/>
-      </w:pPr>
-      <w:r>
-        <w:t xml:space="preserve">DADOS DO APARELHO: </w:t>
-      </w:r>
-      <w:r>
-        <w:t>1</w:t>
-      </w:r>
-      <w:r>
-        <w:t xml:space="preserve">3ª geração Intel® Core™ i5-1345U (10-core, cache de 12 MB, até 4.70 GHz) </w:t>
-      </w:r>
-      <w:r>
-        <w:t>SN:</w:t>
-      </w:r>
-      <w:r>
-        <w:t xml:space="preserve"> </w:t>
-      </w:r>
-      <w:r>
-        <w:t>{</w:t>
-      </w:r>
-      <w:r>
-        <w:t>{serie}</w:t>
+        <w:t>{{serie}</w:t>
       </w:r>
       <w:proofErr w:type="gramStart"/>
       <w:r>
@@ -577,9 +365,6 @@
     <w:p>
       <w:pPr>
         <w:jc w:val="both"/>
-        <w:rPr>
-          <w:spacing w:val="-3"/>
-        </w:rPr>
       </w:pPr>
     </w:p>
     <w:p>
@@ -593,16 +378,8 @@
         <w:t xml:space="preserve"> </w:t>
       </w:r>
       <w:r>
-        <w:t>{</w:t>
-      </w:r>
-      <w:r>
-        <w:t>{data}</w:t>
-      </w:r>
-      <w:r>
-        <w:t>}</w:t>
-      </w:r>
-      <w:bookmarkStart w:id="0" w:name="_GoBack"/>
-      <w:bookmarkEnd w:id="0"/>
+        <w:t>{{data}}</w:t>
+      </w:r>
       <w:r>
         <w:t>.</w:t>
       </w:r>
@@ -647,44 +424,8 @@
       </w:r>
     </w:p>
     <w:p>
-      <w:pPr>
-        <w:rPr>
-          <w:rFonts w:ascii="Arial" w:hAnsi="Arial" w:cs="Arial"/>
-          <w:b/>
-          <w:bCs/>
-          <w:color w:val="222222"/>
-          <w:shd w:val="clear" w:color="auto" w:fill="FFFFFF"/>
-        </w:rPr>
-      </w:pPr>
-      <w:r>
-        <w:rPr>
-          <w:rFonts w:ascii="Arial" w:hAnsi="Arial" w:cs="Arial"/>
-          <w:b/>
-          <w:bCs/>
-          <w:color w:val="222222"/>
-          <w:shd w:val="clear" w:color="auto" w:fill="FFFFFF"/>
-        </w:rPr>
-        <w:t>{</w:t>
-      </w:r>
-      <w:r>
-        <w:rPr>
-          <w:rFonts w:ascii="Arial" w:hAnsi="Arial" w:cs="Arial"/>
-          <w:b/>
-          <w:bCs/>
-          <w:color w:val="222222"/>
-          <w:shd w:val="clear" w:color="auto" w:fill="FFFFFF"/>
-        </w:rPr>
-        <w:t>{nome}</w:t>
-      </w:r>
-      <w:r>
-        <w:rPr>
-          <w:rFonts w:ascii="Arial" w:hAnsi="Arial" w:cs="Arial"/>
-          <w:b/>
-          <w:bCs/>
-          <w:color w:val="222222"/>
-          <w:shd w:val="clear" w:color="auto" w:fill="FFFFFF"/>
-        </w:rPr>
-        <w:t>}</w:t>
+      <w:r>
+        <w:t>{{nome}}</w:t>
       </w:r>
     </w:p>
     <w:p>

</xml_diff>